<commit_message>
Fix week 7 add week 8
</commit_message>
<xml_diff>
--- a/material/Week7-UncertaintyPart2-Risk/SkillCheckWeek7.docx
+++ b/material/Week7-UncertaintyPart2-Risk/SkillCheckWeek7.docx
@@ -53,8 +53,18 @@
           <w:sz w:val="22"/>
           <w:szCs w:val="22"/>
         </w:rPr>
-        <w:t xml:space="preserve">Decisions under uncertainty part </w:t>
-      </w:r>
+        <w:t>Decisions under uncertainty part 2 &amp; Risk</w:t>
+      </w:r>
+    </w:p>
+    <w:p>
+      <w:pPr>
+        <w:spacing w:after="0" w:line="240" w:lineRule="auto"/>
+        <w:rPr>
+          <w:rFonts w:ascii="Times New Roman" w:hAnsi="Times New Roman" w:cs="Times New Roman"/>
+          <w:sz w:val="22"/>
+          <w:szCs w:val="22"/>
+        </w:rPr>
+      </w:pPr>
       <w:r>
         <w:rPr>
           <w:rFonts w:ascii="Times New Roman" w:hAnsi="Times New Roman" w:cs="Times New Roman"/>
@@ -63,7 +73,15 @@
           <w:sz w:val="22"/>
           <w:szCs w:val="22"/>
         </w:rPr>
-        <w:t>2 &amp; Risk</w:t>
+        <w:t xml:space="preserve">Course: </w:t>
+      </w:r>
+      <w:r>
+        <w:rPr>
+          <w:rFonts w:ascii="Times New Roman" w:hAnsi="Times New Roman" w:cs="Times New Roman"/>
+          <w:sz w:val="22"/>
+          <w:szCs w:val="22"/>
+        </w:rPr>
+        <w:t>NAT_R 8001 Decision Analysis for Research and Management of Natural Resources</w:t>
       </w:r>
     </w:p>
     <w:p>
@@ -83,15 +101,15 @@
           <w:sz w:val="22"/>
           <w:szCs w:val="22"/>
         </w:rPr>
-        <w:t xml:space="preserve">Course: </w:t>
-      </w:r>
-      <w:r>
-        <w:rPr>
-          <w:rFonts w:ascii="Times New Roman" w:hAnsi="Times New Roman" w:cs="Times New Roman"/>
-          <w:sz w:val="22"/>
-          <w:szCs w:val="22"/>
-        </w:rPr>
-        <w:t>NAT_R 8001 Decision Analysis for Research and Management of Natural Resources</w:t>
+        <w:t xml:space="preserve">Instructor: </w:t>
+      </w:r>
+      <w:r>
+        <w:rPr>
+          <w:rFonts w:ascii="Times New Roman" w:hAnsi="Times New Roman" w:cs="Times New Roman"/>
+          <w:sz w:val="22"/>
+          <w:szCs w:val="22"/>
+        </w:rPr>
+        <w:t>Brielle Thompson</w:t>
       </w:r>
     </w:p>
     <w:p>
@@ -103,7 +121,10 @@
           <w:szCs w:val="22"/>
         </w:rPr>
       </w:pPr>
-      <w:r>
+    </w:p>
+    <w:p>
+      <w:pPr>
+        <w:spacing w:after="0" w:line="240" w:lineRule="auto"/>
         <w:rPr>
           <w:rFonts w:ascii="Times New Roman" w:hAnsi="Times New Roman" w:cs="Times New Roman"/>
           <w:b/>
@@ -111,15 +132,126 @@
           <w:sz w:val="22"/>
           <w:szCs w:val="22"/>
         </w:rPr>
-        <w:t xml:space="preserve">Instructor: </w:t>
-      </w:r>
-      <w:r>
-        <w:rPr>
-          <w:rFonts w:ascii="Times New Roman" w:hAnsi="Times New Roman" w:cs="Times New Roman"/>
-          <w:sz w:val="22"/>
-          <w:szCs w:val="22"/>
-        </w:rPr>
-        <w:t>Brielle Thompson</w:t>
+      </w:pPr>
+      <w:r>
+        <w:rPr>
+          <w:rFonts w:ascii="Times New Roman" w:hAnsi="Times New Roman" w:cs="Times New Roman"/>
+          <w:b/>
+          <w:bCs/>
+          <w:sz w:val="22"/>
+          <w:szCs w:val="22"/>
+        </w:rPr>
+        <w:t>Instructions:</w:t>
+      </w:r>
+      <w:r>
+        <w:rPr>
+          <w:rFonts w:ascii="Times New Roman" w:hAnsi="Times New Roman" w:cs="Times New Roman"/>
+          <w:b/>
+          <w:bCs/>
+          <w:sz w:val="22"/>
+          <w:szCs w:val="22"/>
+        </w:rPr>
+        <w:t xml:space="preserve"> </w:t>
+      </w:r>
+      <w:r>
+        <w:rPr>
+          <w:rFonts w:ascii="Times New Roman" w:hAnsi="Times New Roman" w:cs="Times New Roman"/>
+          <w:sz w:val="22"/>
+          <w:szCs w:val="22"/>
+        </w:rPr>
+        <w:t xml:space="preserve">Imagine you are a state fishery </w:t>
+      </w:r>
+      <w:r>
+        <w:rPr>
+          <w:rFonts w:ascii="Times New Roman" w:hAnsi="Times New Roman" w:cs="Times New Roman"/>
+          <w:sz w:val="22"/>
+          <w:szCs w:val="22"/>
+        </w:rPr>
+        <w:t>manager</w:t>
+      </w:r>
+      <w:r>
+        <w:rPr>
+          <w:rFonts w:ascii="Times New Roman" w:hAnsi="Times New Roman" w:cs="Times New Roman"/>
+          <w:sz w:val="22"/>
+          <w:szCs w:val="22"/>
+        </w:rPr>
+        <w:t xml:space="preserve"> for </w:t>
+      </w:r>
+      <w:proofErr w:type="gramStart"/>
+      <w:r>
+        <w:rPr>
+          <w:rFonts w:ascii="Times New Roman" w:hAnsi="Times New Roman" w:cs="Times New Roman"/>
+          <w:sz w:val="22"/>
+          <w:szCs w:val="22"/>
+        </w:rPr>
+        <w:t>Missouri</w:t>
+      </w:r>
+      <w:proofErr w:type="gramEnd"/>
+      <w:r>
+        <w:rPr>
+          <w:rFonts w:ascii="Times New Roman" w:hAnsi="Times New Roman" w:cs="Times New Roman"/>
+          <w:sz w:val="22"/>
+          <w:szCs w:val="22"/>
+        </w:rPr>
+        <w:t xml:space="preserve"> and you </w:t>
+      </w:r>
+      <w:proofErr w:type="gramStart"/>
+      <w:r>
+        <w:rPr>
+          <w:rFonts w:ascii="Times New Roman" w:hAnsi="Times New Roman" w:cs="Times New Roman"/>
+          <w:sz w:val="22"/>
+          <w:szCs w:val="22"/>
+        </w:rPr>
+        <w:t>are in charge of</w:t>
+      </w:r>
+      <w:proofErr w:type="gramEnd"/>
+      <w:r>
+        <w:rPr>
+          <w:rFonts w:ascii="Times New Roman" w:hAnsi="Times New Roman" w:cs="Times New Roman"/>
+          <w:sz w:val="22"/>
+          <w:szCs w:val="22"/>
+        </w:rPr>
+        <w:t xml:space="preserve"> choosing between three invasive carp removal strategies </w:t>
+      </w:r>
+      <w:r>
+        <w:rPr>
+          <w:rFonts w:ascii="Times New Roman" w:hAnsi="Times New Roman" w:cs="Times New Roman"/>
+          <w:sz w:val="22"/>
+          <w:szCs w:val="22"/>
+        </w:rPr>
+        <w:t xml:space="preserve">(Strategy A, Strategy B, Strategy C, and No removal). </w:t>
+      </w:r>
+      <w:r>
+        <w:rPr>
+          <w:rFonts w:ascii="Times New Roman" w:hAnsi="Times New Roman" w:cs="Times New Roman"/>
+          <w:sz w:val="22"/>
+          <w:szCs w:val="22"/>
+        </w:rPr>
+        <w:t xml:space="preserve">You aim to have a high </w:t>
+      </w:r>
+      <w:r>
+        <w:rPr>
+          <w:rFonts w:ascii="Times New Roman" w:hAnsi="Times New Roman" w:cs="Times New Roman"/>
+          <w:sz w:val="22"/>
+          <w:szCs w:val="22"/>
+        </w:rPr>
+        <w:t>number</w:t>
+      </w:r>
+      <w:r>
+        <w:rPr>
+          <w:rFonts w:ascii="Times New Roman" w:hAnsi="Times New Roman" w:cs="Times New Roman"/>
+          <w:sz w:val="22"/>
+          <w:szCs w:val="22"/>
+        </w:rPr>
+        <w:t xml:space="preserve"> of invasive carp removed. However, each strategy comes with risk and there is a chance that the </w:t>
+      </w:r>
+      <w:r>
+        <w:rPr>
+          <w:rFonts w:ascii="Times New Roman" w:hAnsi="Times New Roman" w:cs="Times New Roman"/>
+          <w:sz w:val="22"/>
+          <w:szCs w:val="22"/>
+        </w:rPr>
+        <w:t xml:space="preserve">amount of removal identified will not occur. </w:t>
       </w:r>
     </w:p>
     <w:p>
@@ -131,162 +263,20 @@
           <w:szCs w:val="22"/>
         </w:rPr>
       </w:pPr>
+      <w:r>
+        <w:rPr>
+          <w:rFonts w:ascii="Times New Roman" w:hAnsi="Times New Roman" w:cs="Times New Roman"/>
+          <w:sz w:val="22"/>
+          <w:szCs w:val="22"/>
+        </w:rPr>
+        <w:t>Below is the problem’s decision tree:</w:t>
+      </w:r>
     </w:p>
     <w:p>
       <w:pPr>
         <w:spacing w:after="0" w:line="240" w:lineRule="auto"/>
         <w:rPr>
           <w:rFonts w:ascii="Times New Roman" w:hAnsi="Times New Roman" w:cs="Times New Roman"/>
-          <w:b/>
-          <w:bCs/>
-          <w:sz w:val="22"/>
-          <w:szCs w:val="22"/>
-        </w:rPr>
-      </w:pPr>
-      <w:r>
-        <w:rPr>
-          <w:rFonts w:ascii="Times New Roman" w:hAnsi="Times New Roman" w:cs="Times New Roman"/>
-          <w:b/>
-          <w:bCs/>
-          <w:sz w:val="22"/>
-          <w:szCs w:val="22"/>
-        </w:rPr>
-        <w:t>Instructions:</w:t>
-      </w:r>
-      <w:r>
-        <w:rPr>
-          <w:rFonts w:ascii="Times New Roman" w:hAnsi="Times New Roman" w:cs="Times New Roman"/>
-          <w:b/>
-          <w:bCs/>
-          <w:sz w:val="22"/>
-          <w:szCs w:val="22"/>
-        </w:rPr>
-        <w:t xml:space="preserve"> </w:t>
-      </w:r>
-      <w:r>
-        <w:rPr>
-          <w:rFonts w:ascii="Times New Roman" w:hAnsi="Times New Roman" w:cs="Times New Roman"/>
-          <w:sz w:val="22"/>
-          <w:szCs w:val="22"/>
-        </w:rPr>
-        <w:t xml:space="preserve">Imagine you are a state fishery </w:t>
-      </w:r>
-      <w:r>
-        <w:rPr>
-          <w:rFonts w:ascii="Times New Roman" w:hAnsi="Times New Roman" w:cs="Times New Roman"/>
-          <w:sz w:val="22"/>
-          <w:szCs w:val="22"/>
-        </w:rPr>
-        <w:t>manager</w:t>
-      </w:r>
-      <w:r>
-        <w:rPr>
-          <w:rFonts w:ascii="Times New Roman" w:hAnsi="Times New Roman" w:cs="Times New Roman"/>
-          <w:sz w:val="22"/>
-          <w:szCs w:val="22"/>
-        </w:rPr>
-        <w:t xml:space="preserve"> for </w:t>
-      </w:r>
-      <w:proofErr w:type="gramStart"/>
-      <w:r>
-        <w:rPr>
-          <w:rFonts w:ascii="Times New Roman" w:hAnsi="Times New Roman" w:cs="Times New Roman"/>
-          <w:sz w:val="22"/>
-          <w:szCs w:val="22"/>
-        </w:rPr>
-        <w:t>Missouri</w:t>
-      </w:r>
-      <w:proofErr w:type="gramEnd"/>
-      <w:r>
-        <w:rPr>
-          <w:rFonts w:ascii="Times New Roman" w:hAnsi="Times New Roman" w:cs="Times New Roman"/>
-          <w:sz w:val="22"/>
-          <w:szCs w:val="22"/>
-        </w:rPr>
-        <w:t xml:space="preserve"> and you </w:t>
-      </w:r>
-      <w:proofErr w:type="gramStart"/>
-      <w:r>
-        <w:rPr>
-          <w:rFonts w:ascii="Times New Roman" w:hAnsi="Times New Roman" w:cs="Times New Roman"/>
-          <w:sz w:val="22"/>
-          <w:szCs w:val="22"/>
-        </w:rPr>
-        <w:t>are in charge of</w:t>
-      </w:r>
-      <w:proofErr w:type="gramEnd"/>
-      <w:r>
-        <w:rPr>
-          <w:rFonts w:ascii="Times New Roman" w:hAnsi="Times New Roman" w:cs="Times New Roman"/>
-          <w:sz w:val="22"/>
-          <w:szCs w:val="22"/>
-        </w:rPr>
-        <w:t xml:space="preserve"> choosing between three invasive carp removal strategies </w:t>
-      </w:r>
-      <w:r>
-        <w:rPr>
-          <w:rFonts w:ascii="Times New Roman" w:hAnsi="Times New Roman" w:cs="Times New Roman"/>
-          <w:sz w:val="22"/>
-          <w:szCs w:val="22"/>
-        </w:rPr>
-        <w:t xml:space="preserve">(Strategy A, Strategy B, Strategy C, and No removal). </w:t>
-      </w:r>
-      <w:r>
-        <w:rPr>
-          <w:rFonts w:ascii="Times New Roman" w:hAnsi="Times New Roman" w:cs="Times New Roman"/>
-          <w:sz w:val="22"/>
-          <w:szCs w:val="22"/>
-        </w:rPr>
-        <w:t xml:space="preserve">You aim to have a high </w:t>
-      </w:r>
-      <w:r>
-        <w:rPr>
-          <w:rFonts w:ascii="Times New Roman" w:hAnsi="Times New Roman" w:cs="Times New Roman"/>
-          <w:sz w:val="22"/>
-          <w:szCs w:val="22"/>
-        </w:rPr>
-        <w:t>number</w:t>
-      </w:r>
-      <w:r>
-        <w:rPr>
-          <w:rFonts w:ascii="Times New Roman" w:hAnsi="Times New Roman" w:cs="Times New Roman"/>
-          <w:sz w:val="22"/>
-          <w:szCs w:val="22"/>
-        </w:rPr>
-        <w:t xml:space="preserve"> of invasive carp removed. However, each strategy comes with risk and there is a chance that the </w:t>
-      </w:r>
-      <w:r>
-        <w:rPr>
-          <w:rFonts w:ascii="Times New Roman" w:hAnsi="Times New Roman" w:cs="Times New Roman"/>
-          <w:sz w:val="22"/>
-          <w:szCs w:val="22"/>
-        </w:rPr>
-        <w:t xml:space="preserve">amount of removal identified will not occur. </w:t>
-      </w:r>
-    </w:p>
-    <w:p>
-      <w:pPr>
-        <w:spacing w:after="0" w:line="240" w:lineRule="auto"/>
-        <w:rPr>
-          <w:rFonts w:ascii="Times New Roman" w:hAnsi="Times New Roman" w:cs="Times New Roman"/>
-          <w:sz w:val="22"/>
-          <w:szCs w:val="22"/>
-        </w:rPr>
-      </w:pPr>
-      <w:r>
-        <w:rPr>
-          <w:rFonts w:ascii="Times New Roman" w:hAnsi="Times New Roman" w:cs="Times New Roman"/>
-          <w:sz w:val="22"/>
-          <w:szCs w:val="22"/>
-        </w:rPr>
-        <w:t>Below is the problem’s decision tree:</w:t>
-      </w:r>
-    </w:p>
-    <w:p>
-      <w:pPr>
-        <w:spacing w:after="0" w:line="240" w:lineRule="auto"/>
-        <w:rPr>
-          <w:rFonts w:ascii="Times New Roman" w:hAnsi="Times New Roman" w:cs="Times New Roman"/>
           <w:sz w:val="22"/>
           <w:szCs w:val="22"/>
         </w:rPr>
@@ -298,10 +288,10 @@
           <w:szCs w:val="22"/>
         </w:rPr>
         <w:drawing>
-          <wp:inline distT="0" distB="0" distL="0" distR="0" wp14:anchorId="4AA685C6" wp14:editId="7C509895">
-            <wp:extent cx="5943600" cy="4698365"/>
-            <wp:effectExtent l="0" t="0" r="0" b="6985"/>
-            <wp:docPr id="980255738" name="Picture 1" descr="A diagram of a problem&#10;&#10;AI-generated content may be incorrect."/>
+          <wp:inline distT="0" distB="0" distL="0" distR="0" wp14:anchorId="48362301" wp14:editId="21946F6B">
+            <wp:extent cx="5943600" cy="4523740"/>
+            <wp:effectExtent l="0" t="0" r="0" b="0"/>
+            <wp:docPr id="1322289646" name="Picture 1" descr="A diagram of a strategy&#10;&#10;AI-generated content may be incorrect."/>
             <wp:cNvGraphicFramePr>
               <a:graphicFrameLocks xmlns:a="http://schemas.openxmlformats.org/drawingml/2006/main" noChangeAspect="1"/>
             </wp:cNvGraphicFramePr>
@@ -309,7 +299,7 @@
               <a:graphicData uri="http://schemas.openxmlformats.org/drawingml/2006/picture">
                 <pic:pic xmlns:pic="http://schemas.openxmlformats.org/drawingml/2006/picture">
                   <pic:nvPicPr>
-                    <pic:cNvPr id="980255738" name="Picture 1" descr="A diagram of a problem&#10;&#10;AI-generated content may be incorrect."/>
+                    <pic:cNvPr id="1322289646" name="Picture 1" descr="A diagram of a strategy&#10;&#10;AI-generated content may be incorrect."/>
                     <pic:cNvPicPr/>
                   </pic:nvPicPr>
                   <pic:blipFill>
@@ -321,7 +311,7 @@
                   <pic:spPr>
                     <a:xfrm>
                       <a:off x="0" y="0"/>
-                      <a:ext cx="5943600" cy="4698365"/>
+                      <a:ext cx="5943600" cy="4523740"/>
                     </a:xfrm>
                     <a:prstGeom prst="rect">
                       <a:avLst/>
@@ -1896,6 +1886,7 @@
   <w:style w:type="character" w:default="1" w:styleId="DefaultParagraphFont">
     <w:name w:val="Default Paragraph Font"/>
     <w:uiPriority w:val="1"/>
+    <w:semiHidden/>
     <w:unhideWhenUsed/>
   </w:style>
   <w:style w:type="table" w:default="1" w:styleId="TableNormal">

</xml_diff>